<commit_message>
agregué las fechas de cambio de tiendas y las nuevas tiendas a horas trabajadas. Adapté Presupuestos_v6 a eso y le hice cambios menores. Actualicé todo gastos a abril 2026
</commit_message>
<xml_diff>
--- a/Odoo/Exportación de facturas en Odoo.docx
+++ b/Odoo/Exportación de facturas en Odoo.docx
@@ -1,6 +1,6 @@
 
 <file path=word/document.xml><?xml version="1.0" encoding="utf-8"?>
-<w:document xmlns:wpc="http://schemas.microsoft.com/office/word/2010/wordprocessingCanvas" xmlns:cx="http://schemas.microsoft.com/office/drawing/2014/chartex" xmlns:mc="http://schemas.openxmlformats.org/markup-compatibility/2006" xmlns:o="urn:schemas-microsoft-com:office:office" xmlns:r="http://schemas.openxmlformats.org/officeDocument/2006/relationships" xmlns:m="http://schemas.openxmlformats.org/officeDocument/2006/math" xmlns:v="urn:schemas-microsoft-com:vml" xmlns:wp14="http://schemas.microsoft.com/office/word/2010/wordprocessingDrawing" xmlns:wp="http://schemas.openxmlformats.org/drawingml/2006/wordprocessingDrawing" xmlns:w10="urn:schemas-microsoft-com:office:word" xmlns:w="http://schemas.openxmlformats.org/wordprocessingml/2006/main" xmlns:w14="http://schemas.microsoft.com/office/word/2010/wordml" xmlns:w15="http://schemas.microsoft.com/office/word/2012/wordml" xmlns:w16se="http://schemas.microsoft.com/office/word/2015/wordml/symex" xmlns:wpg="http://schemas.microsoft.com/office/word/2010/wordprocessingGroup" xmlns:wpi="http://schemas.microsoft.com/office/word/2010/wordprocessingInk" xmlns:wne="http://schemas.microsoft.com/office/word/2006/wordml" xmlns:wps="http://schemas.microsoft.com/office/word/2010/wordprocessingShape" mc:Ignorable="w14 w15 w16se wp14">
+<w:document xmlns:wpc="http://schemas.microsoft.com/office/word/2010/wordprocessingCanvas" xmlns:cx="http://schemas.microsoft.com/office/drawing/2014/chartex" xmlns:cx1="http://schemas.microsoft.com/office/drawing/2015/9/8/chartex" xmlns:mc="http://schemas.openxmlformats.org/markup-compatibility/2006" xmlns:o="urn:schemas-microsoft-com:office:office" xmlns:r="http://schemas.openxmlformats.org/officeDocument/2006/relationships" xmlns:m="http://schemas.openxmlformats.org/officeDocument/2006/math" xmlns:v="urn:schemas-microsoft-com:vml" xmlns:wp14="http://schemas.microsoft.com/office/word/2010/wordprocessingDrawing" xmlns:wp="http://schemas.openxmlformats.org/drawingml/2006/wordprocessingDrawing" xmlns:w10="urn:schemas-microsoft-com:office:word" xmlns:w="http://schemas.openxmlformats.org/wordprocessingml/2006/main" xmlns:w14="http://schemas.microsoft.com/office/word/2010/wordml" xmlns:w15="http://schemas.microsoft.com/office/word/2012/wordml" xmlns:w16se="http://schemas.microsoft.com/office/word/2015/wordml/symex" xmlns:wpg="http://schemas.microsoft.com/office/word/2010/wordprocessingGroup" xmlns:wpi="http://schemas.microsoft.com/office/word/2010/wordprocessingInk" xmlns:wne="http://schemas.microsoft.com/office/word/2006/wordml" xmlns:wps="http://schemas.microsoft.com/office/word/2010/wordprocessingShape" mc:Ignorable="w14 w15 w16se wp14">
   <w:body>
     <w:p>
       <w:pPr>
@@ -431,11 +431,20 @@
           <w:lang w:val="es-MX"/>
         </w:rPr>
       </w:pPr>
-      <w:r>
-        <w:rPr>
-          <w:lang w:val="es-MX"/>
-        </w:rPr>
-        <w:t xml:space="preserve">Proveedores: </w:t>
+      <w:bookmarkStart w:id="0" w:name="_GoBack"/>
+      <w:r>
+        <w:rPr>
+          <w:b/>
+          <w:lang w:val="es-MX"/>
+        </w:rPr>
+        <w:t>Proveedores</w:t>
+      </w:r>
+      <w:bookmarkEnd w:id="0"/>
+      <w:r>
+        <w:rPr>
+          <w:lang w:val="es-MX"/>
+        </w:rPr>
+        <w:t xml:space="preserve">: </w:t>
       </w:r>
       <w:r>
         <w:rPr>
@@ -1487,14 +1496,12 @@
           <w:lang w:val="es-MX"/>
         </w:rPr>
       </w:pPr>
-      <w:bookmarkStart w:id="0" w:name="_GoBack"/>
       <w:r>
         <w:rPr>
           <w:lang w:val="es-MX"/>
         </w:rPr>
         <w:t>laFATRoy2303#$#</w:t>
       </w:r>
-      <w:bookmarkEnd w:id="0"/>
     </w:p>
     <w:p>
       <w:pPr>
@@ -1514,7 +1521,7 @@
 </file>
 
 <file path=word/numbering.xml><?xml version="1.0" encoding="utf-8"?>
-<w:numbering xmlns:wpc="http://schemas.microsoft.com/office/word/2010/wordprocessingCanvas" xmlns:cx="http://schemas.microsoft.com/office/drawing/2014/chartex" xmlns:mc="http://schemas.openxmlformats.org/markup-compatibility/2006" xmlns:o="urn:schemas-microsoft-com:office:office" xmlns:r="http://schemas.openxmlformats.org/officeDocument/2006/relationships" xmlns:m="http://schemas.openxmlformats.org/officeDocument/2006/math" xmlns:v="urn:schemas-microsoft-com:vml" xmlns:wp14="http://schemas.microsoft.com/office/word/2010/wordprocessingDrawing" xmlns:wp="http://schemas.openxmlformats.org/drawingml/2006/wordprocessingDrawing" xmlns:w10="urn:schemas-microsoft-com:office:word" xmlns:w="http://schemas.openxmlformats.org/wordprocessingml/2006/main" xmlns:w14="http://schemas.microsoft.com/office/word/2010/wordml" xmlns:w15="http://schemas.microsoft.com/office/word/2012/wordml" xmlns:w16se="http://schemas.microsoft.com/office/word/2015/wordml/symex" xmlns:wpg="http://schemas.microsoft.com/office/word/2010/wordprocessingGroup" xmlns:wpi="http://schemas.microsoft.com/office/word/2010/wordprocessingInk" xmlns:wne="http://schemas.microsoft.com/office/word/2006/wordml" xmlns:wps="http://schemas.microsoft.com/office/word/2010/wordprocessingShape" mc:Ignorable="w14 w15 w16se wp14">
+<w:numbering xmlns:wpc="http://schemas.microsoft.com/office/word/2010/wordprocessingCanvas" xmlns:cx="http://schemas.microsoft.com/office/drawing/2014/chartex" xmlns:cx1="http://schemas.microsoft.com/office/drawing/2015/9/8/chartex" xmlns:mc="http://schemas.openxmlformats.org/markup-compatibility/2006" xmlns:o="urn:schemas-microsoft-com:office:office" xmlns:r="http://schemas.openxmlformats.org/officeDocument/2006/relationships" xmlns:m="http://schemas.openxmlformats.org/officeDocument/2006/math" xmlns:v="urn:schemas-microsoft-com:vml" xmlns:wp14="http://schemas.microsoft.com/office/word/2010/wordprocessingDrawing" xmlns:wp="http://schemas.openxmlformats.org/drawingml/2006/wordprocessingDrawing" xmlns:w10="urn:schemas-microsoft-com:office:word" xmlns:w="http://schemas.openxmlformats.org/wordprocessingml/2006/main" xmlns:w14="http://schemas.microsoft.com/office/word/2010/wordml" xmlns:w15="http://schemas.microsoft.com/office/word/2012/wordml" xmlns:w16se="http://schemas.microsoft.com/office/word/2015/wordml/symex" xmlns:wpg="http://schemas.microsoft.com/office/word/2010/wordprocessingGroup" xmlns:wpi="http://schemas.microsoft.com/office/word/2010/wordprocessingInk" xmlns:wne="http://schemas.microsoft.com/office/word/2006/wordml" xmlns:wps="http://schemas.microsoft.com/office/word/2010/wordprocessingShape" mc:Ignorable="w14 w15 w16se wp14">
   <w:abstractNum w:abstractNumId="0" w15:restartNumberingAfterBreak="0">
     <w:nsid w:val="069B1A97"/>
     <w:multiLevelType w:val="hybridMultilevel"/>

</xml_diff>

<commit_message>
Normalizar finales de línea. Reporte ventas cuero junio. Reporte histórico joyería a junio 2026. Comienzo de preparación de datos para presupuestos y gastos junio 2026
</commit_message>
<xml_diff>
--- a/Odoo/Exportación de facturas en Odoo.docx
+++ b/Odoo/Exportación de facturas en Odoo.docx
@@ -473,8 +473,30 @@
         <w:rPr>
           <w:lang w:val="es-MX"/>
         </w:rPr>
-        <w:t>: Contabilidad/Reportes/Reporte analítico. Elegir vista = lista. Filtrar, escribiendo en el cuadro “compra” para cuenta analítica. Agregar columnas a la lista “centro de costos” y “Contacto”. Seleccionar todas las filas y exportar así como viene.</w:t>
-      </w:r>
+        <w:t xml:space="preserve">: Contabilidad/Reportes/Reporte analítico. Elegir vista = lista. Filtrar, escribiendo en el cuadro “compra” para cuenta analítica. Agregar columnas a la lista “centro de costos” y “Contacto”. Seleccionar todas las filas y </w:t>
+      </w:r>
+      <w:proofErr w:type="gramStart"/>
+      <w:r>
+        <w:rPr>
+          <w:lang w:val="es-MX"/>
+        </w:rPr>
+        <w:t>exportar</w:t>
+      </w:r>
+      <w:proofErr w:type="gramEnd"/>
+      <w:r>
+        <w:rPr>
+          <w:lang w:val="es-MX"/>
+        </w:rPr>
+        <w:t xml:space="preserve"> así como viene.</w:t>
+      </w:r>
+    </w:p>
+    <w:p>
+      <w:pPr>
+        <w:ind w:left="360"/>
+        <w:rPr>
+          <w:lang w:val="es-MX"/>
+        </w:rPr>
+      </w:pPr>
       <w:bookmarkStart w:id="0" w:name="_GoBack"/>
       <w:bookmarkEnd w:id="0"/>
     </w:p>
@@ -822,6 +844,7 @@
         <w:rPr>
           <w:lang w:val="es-MX"/>
         </w:rPr>
+        <w:lastRenderedPageBreak/>
         <w:t>No hace falta que pongan la hora en las notas.</w:t>
       </w:r>
     </w:p>
@@ -835,7 +858,6 @@
         <w:rPr>
           <w:lang w:val="es-MX"/>
         </w:rPr>
-        <w:lastRenderedPageBreak/>
         <w:t>Recordar que “Grabado” va como nota interna, para que queden identificados los productos, y no como nota general.</w:t>
       </w:r>
     </w:p>
@@ -1438,7 +1460,6 @@
           <w:b/>
           <w:lang w:val="es-MX"/>
         </w:rPr>
-        <w:lastRenderedPageBreak/>
         <w:t>ALQUILERES</w:t>
       </w:r>
     </w:p>

</xml_diff>

<commit_message>
sigo trabajando en gastos y sueldos
</commit_message>
<xml_diff>
--- a/Odoo/Exportación de facturas en Odoo.docx
+++ b/Odoo/Exportación de facturas en Odoo.docx
@@ -1,6 +1,6 @@
 
 <file path=word/document.xml><?xml version="1.0" encoding="utf-8"?>
-<w:document xmlns:wpc="http://schemas.microsoft.com/office/word/2010/wordprocessingCanvas" xmlns:cx="http://schemas.microsoft.com/office/drawing/2014/chartex" xmlns:cx1="http://schemas.microsoft.com/office/drawing/2015/9/8/chartex" xmlns:mc="http://schemas.openxmlformats.org/markup-compatibility/2006" xmlns:o="urn:schemas-microsoft-com:office:office" xmlns:r="http://schemas.openxmlformats.org/officeDocument/2006/relationships" xmlns:m="http://schemas.openxmlformats.org/officeDocument/2006/math" xmlns:v="urn:schemas-microsoft-com:vml" xmlns:wp14="http://schemas.microsoft.com/office/word/2010/wordprocessingDrawing" xmlns:wp="http://schemas.openxmlformats.org/drawingml/2006/wordprocessingDrawing" xmlns:w10="urn:schemas-microsoft-com:office:word" xmlns:w="http://schemas.openxmlformats.org/wordprocessingml/2006/main" xmlns:w14="http://schemas.microsoft.com/office/word/2010/wordml" xmlns:w15="http://schemas.microsoft.com/office/word/2012/wordml" xmlns:w16se="http://schemas.microsoft.com/office/word/2015/wordml/symex" xmlns:wpg="http://schemas.microsoft.com/office/word/2010/wordprocessingGroup" xmlns:wpi="http://schemas.microsoft.com/office/word/2010/wordprocessingInk" xmlns:wne="http://schemas.microsoft.com/office/word/2006/wordml" xmlns:wps="http://schemas.microsoft.com/office/word/2010/wordprocessingShape" mc:Ignorable="w14 w15 w16se wp14">
+<w:document xmlns:wpc="http://schemas.microsoft.com/office/word/2010/wordprocessingCanvas" xmlns:cx="http://schemas.microsoft.com/office/drawing/2014/chartex" xmlns:mc="http://schemas.openxmlformats.org/markup-compatibility/2006" xmlns:o="urn:schemas-microsoft-com:office:office" xmlns:r="http://schemas.openxmlformats.org/officeDocument/2006/relationships" xmlns:m="http://schemas.openxmlformats.org/officeDocument/2006/math" xmlns:v="urn:schemas-microsoft-com:vml" xmlns:wp14="http://schemas.microsoft.com/office/word/2010/wordprocessingDrawing" xmlns:wp="http://schemas.openxmlformats.org/drawingml/2006/wordprocessingDrawing" xmlns:w10="urn:schemas-microsoft-com:office:word" xmlns:w="http://schemas.openxmlformats.org/wordprocessingml/2006/main" xmlns:w14="http://schemas.microsoft.com/office/word/2010/wordml" xmlns:w15="http://schemas.microsoft.com/office/word/2012/wordml" xmlns:w16se="http://schemas.microsoft.com/office/word/2015/wordml/symex" xmlns:wpg="http://schemas.microsoft.com/office/word/2010/wordprocessingGroup" xmlns:wpi="http://schemas.microsoft.com/office/word/2010/wordprocessingInk" xmlns:wne="http://schemas.microsoft.com/office/word/2006/wordml" xmlns:wps="http://schemas.microsoft.com/office/word/2010/wordprocessingShape" mc:Ignorable="w14 w15 w16se wp14">
   <w:body>
     <w:p>
       <w:pPr>
@@ -497,8 +497,6 @@
           <w:lang w:val="es-MX"/>
         </w:rPr>
       </w:pPr>
-      <w:bookmarkStart w:id="0" w:name="_GoBack"/>
-      <w:bookmarkEnd w:id="0"/>
     </w:p>
     <w:p>
       <w:pPr>
@@ -921,14 +919,16 @@
         <w:rPr>
           <w:lang w:val="es-MX"/>
         </w:rPr>
-        <w:t>Fiserv lafatroY2585</w:t>
-      </w:r>
-      <w:r>
-        <w:rPr>
-          <w:lang w:val="es-MX"/>
-        </w:rPr>
-        <w:t>#</w:t>
-      </w:r>
+        <w:t xml:space="preserve">Fiserv </w:t>
+      </w:r>
+      <w:r>
+        <w:rPr>
+          <w:lang w:val="es-MX"/>
+        </w:rPr>
+        <w:t>lafatroY2586#</w:t>
+      </w:r>
+      <w:bookmarkStart w:id="0" w:name="_GoBack"/>
+      <w:bookmarkEnd w:id="0"/>
     </w:p>
     <w:p>
       <w:pPr>
@@ -1555,7 +1555,7 @@
 </file>
 
 <file path=word/numbering.xml><?xml version="1.0" encoding="utf-8"?>
-<w:numbering xmlns:wpc="http://schemas.microsoft.com/office/word/2010/wordprocessingCanvas" xmlns:cx="http://schemas.microsoft.com/office/drawing/2014/chartex" xmlns:cx1="http://schemas.microsoft.com/office/drawing/2015/9/8/chartex" xmlns:mc="http://schemas.openxmlformats.org/markup-compatibility/2006" xmlns:o="urn:schemas-microsoft-com:office:office" xmlns:r="http://schemas.openxmlformats.org/officeDocument/2006/relationships" xmlns:m="http://schemas.openxmlformats.org/officeDocument/2006/math" xmlns:v="urn:schemas-microsoft-com:vml" xmlns:wp14="http://schemas.microsoft.com/office/word/2010/wordprocessingDrawing" xmlns:wp="http://schemas.openxmlformats.org/drawingml/2006/wordprocessingDrawing" xmlns:w10="urn:schemas-microsoft-com:office:word" xmlns:w="http://schemas.openxmlformats.org/wordprocessingml/2006/main" xmlns:w14="http://schemas.microsoft.com/office/word/2010/wordml" xmlns:w15="http://schemas.microsoft.com/office/word/2012/wordml" xmlns:w16se="http://schemas.microsoft.com/office/word/2015/wordml/symex" xmlns:wpg="http://schemas.microsoft.com/office/word/2010/wordprocessingGroup" xmlns:wpi="http://schemas.microsoft.com/office/word/2010/wordprocessingInk" xmlns:wne="http://schemas.microsoft.com/office/word/2006/wordml" xmlns:wps="http://schemas.microsoft.com/office/word/2010/wordprocessingShape" mc:Ignorable="w14 w15 w16se wp14">
+<w:numbering xmlns:wpc="http://schemas.microsoft.com/office/word/2010/wordprocessingCanvas" xmlns:cx="http://schemas.microsoft.com/office/drawing/2014/chartex" xmlns:mc="http://schemas.openxmlformats.org/markup-compatibility/2006" xmlns:o="urn:schemas-microsoft-com:office:office" xmlns:r="http://schemas.openxmlformats.org/officeDocument/2006/relationships" xmlns:m="http://schemas.openxmlformats.org/officeDocument/2006/math" xmlns:v="urn:schemas-microsoft-com:vml" xmlns:wp14="http://schemas.microsoft.com/office/word/2010/wordprocessingDrawing" xmlns:wp="http://schemas.openxmlformats.org/drawingml/2006/wordprocessingDrawing" xmlns:w10="urn:schemas-microsoft-com:office:word" xmlns:w="http://schemas.openxmlformats.org/wordprocessingml/2006/main" xmlns:w14="http://schemas.microsoft.com/office/word/2010/wordml" xmlns:w15="http://schemas.microsoft.com/office/word/2012/wordml" xmlns:w16se="http://schemas.microsoft.com/office/word/2015/wordml/symex" xmlns:wpg="http://schemas.microsoft.com/office/word/2010/wordprocessingGroup" xmlns:wpi="http://schemas.microsoft.com/office/word/2010/wordprocessingInk" xmlns:wne="http://schemas.microsoft.com/office/word/2006/wordml" xmlns:wps="http://schemas.microsoft.com/office/word/2010/wordprocessingShape" mc:Ignorable="w14 w15 w16se wp14">
   <w:abstractNum w:abstractNumId="0" w15:restartNumberingAfterBreak="0">
     <w:nsid w:val="069B1A97"/>
     <w:multiLevelType w:val="hybridMultilevel"/>

</xml_diff>

<commit_message>
sin venta joyería. Creé R para automatizar tabla horas de vendedoras por mes. Empecé a buscar archivos para obtener datos de clientes
</commit_message>
<xml_diff>
--- a/Odoo/Exportación de facturas en Odoo.docx
+++ b/Odoo/Exportación de facturas en Odoo.docx
@@ -278,58 +278,44 @@
         <w:rPr>
           <w:lang w:val="es-MX"/>
         </w:rPr>
-        <w:t xml:space="preserve">Para los </w:t>
-      </w:r>
-      <w:r>
-        <w:rPr>
-          <w:b/>
-          <w:lang w:val="es-MX"/>
-        </w:rPr>
-        <w:t>precios</w:t>
-      </w:r>
-      <w:r>
-        <w:rPr>
-          <w:lang w:val="es-MX"/>
-        </w:rPr>
-        <w:t xml:space="preserve"> (para ponérselo al stock) Ventas/</w:t>
-      </w:r>
-      <w:r>
-        <w:rPr>
-          <w:lang w:val="es-MX"/>
-        </w:rPr>
-        <w:t>Productos/</w:t>
-      </w:r>
-      <w:r>
-        <w:rPr>
-          <w:lang w:val="es-MX"/>
-        </w:rPr>
-        <w:t>Listas de precios</w:t>
-      </w:r>
-      <w:proofErr w:type="gramStart"/>
-      <w:r>
-        <w:rPr>
-          <w:lang w:val="es-MX"/>
-        </w:rPr>
-        <w:t>/(</w:t>
-      </w:r>
-      <w:proofErr w:type="gramEnd"/>
-      <w:r>
-        <w:rPr>
-          <w:lang w:val="es-MX"/>
-        </w:rPr>
-        <w:t>seleccionar e</w:t>
-      </w:r>
-      <w:r>
-        <w:rPr>
-          <w:lang w:val="es-MX"/>
-        </w:rPr>
-        <w:t>l de El Lucero) Lista (Vale)</w:t>
-      </w:r>
-      <w:r>
-        <w:rPr>
-          <w:lang w:val="es-MX"/>
-        </w:rPr>
-        <w:t xml:space="preserve"> (plantilla). Ojo que no tienen los impuestos.</w:t>
+        <w:t xml:space="preserve">Para el </w:t>
+      </w:r>
+      <w:r>
+        <w:rPr>
+          <w:b/>
+          <w:lang w:val="es-MX"/>
+        </w:rPr>
+        <w:t>stock por modelo</w:t>
+      </w:r>
+      <w:r>
+        <w:rPr>
+          <w:lang w:val="es-MX"/>
+        </w:rPr>
+        <w:t xml:space="preserve"> que uso para Joyería sin venta</w:t>
+      </w:r>
+      <w:r>
+        <w:rPr>
+          <w:lang w:val="es-MX"/>
+        </w:rPr>
+        <w:t xml:space="preserve">: </w:t>
+      </w:r>
+      <w:r>
+        <w:rPr>
+          <w:lang w:val="es-MX"/>
+        </w:rPr>
+        <w:t>Inventario/Reportes/Ubicaciones/Stock</w:t>
+      </w:r>
+      <w:r>
+        <w:rPr>
+          <w:lang w:val="es-MX"/>
+        </w:rPr>
+        <w:t xml:space="preserve"> x descripción </w:t>
+      </w:r>
+      <w:r>
+        <w:rPr>
+          <w:lang w:val="es-MX"/>
+        </w:rPr>
+        <w:t>(Vale)</w:t>
       </w:r>
     </w:p>
     <w:p>
@@ -347,46 +333,64 @@
         <w:rPr>
           <w:lang w:val="es-MX"/>
         </w:rPr>
-        <w:t xml:space="preserve">Para </w:t>
-      </w:r>
-      <w:r>
-        <w:rPr>
-          <w:lang w:val="es-MX"/>
-        </w:rPr>
-        <w:t xml:space="preserve">productos con </w:t>
-      </w:r>
-      <w:r>
-        <w:rPr>
-          <w:b/>
-          <w:lang w:val="es-MX"/>
-        </w:rPr>
-        <w:t>impuestos interno</w:t>
-      </w:r>
-      <w:r>
-        <w:rPr>
-          <w:lang w:val="es-MX"/>
-        </w:rPr>
-        <w:t>. Inventario/Productos/Variantes del producto</w:t>
-      </w:r>
-      <w:r>
-        <w:rPr>
-          <w:lang w:val="es-MX"/>
-        </w:rPr>
-        <w:t>/</w:t>
-      </w:r>
-      <w:proofErr w:type="spellStart"/>
-      <w:r>
-        <w:rPr>
-          <w:lang w:val="es-MX"/>
-        </w:rPr>
-        <w:t>productos_imp_interno</w:t>
-      </w:r>
-      <w:proofErr w:type="spellEnd"/>
-      <w:r>
-        <w:rPr>
-          <w:lang w:val="es-MX"/>
-        </w:rPr>
-        <w:t xml:space="preserve"> (Vale)</w:t>
+        <w:t xml:space="preserve">Para los </w:t>
+      </w:r>
+      <w:r>
+        <w:rPr>
+          <w:b/>
+          <w:lang w:val="es-MX"/>
+        </w:rPr>
+        <w:t>precios</w:t>
+      </w:r>
+      <w:r>
+        <w:rPr>
+          <w:lang w:val="es-MX"/>
+        </w:rPr>
+        <w:t xml:space="preserve"> (para ponérselo al stock) Ventas/</w:t>
+      </w:r>
+      <w:r>
+        <w:rPr>
+          <w:lang w:val="es-MX"/>
+        </w:rPr>
+        <w:t>Productos/</w:t>
+      </w:r>
+      <w:r>
+        <w:rPr>
+          <w:lang w:val="es-MX"/>
+        </w:rPr>
+        <w:t>Listas de precios</w:t>
+      </w:r>
+      <w:proofErr w:type="gramStart"/>
+      <w:r>
+        <w:rPr>
+          <w:lang w:val="es-MX"/>
+        </w:rPr>
+        <w:t>/(</w:t>
+      </w:r>
+      <w:proofErr w:type="gramEnd"/>
+      <w:r>
+        <w:rPr>
+          <w:lang w:val="es-MX"/>
+        </w:rPr>
+        <w:t>seleccionar</w:t>
+      </w:r>
+      <w:r>
+        <w:rPr>
+          <w:lang w:val="es-MX"/>
+        </w:rPr>
+        <w:t xml:space="preserve"> e</w:t>
+      </w:r>
+      <w:r>
+        <w:rPr>
+          <w:lang w:val="es-MX"/>
+        </w:rPr>
+        <w:t>l de El Lucero) Lista (Vale)</w:t>
+      </w:r>
+      <w:r>
+        <w:rPr>
+          <w:lang w:val="es-MX"/>
+        </w:rPr>
+        <w:t xml:space="preserve"> (plantilla). Ojo que no tienen los impuestos.</w:t>
       </w:r>
     </w:p>
     <w:p>
@@ -404,20 +408,46 @@
         <w:rPr>
           <w:lang w:val="es-MX"/>
         </w:rPr>
-        <w:t xml:space="preserve">Para el </w:t>
-      </w:r>
-      <w:r>
-        <w:rPr>
-          <w:b/>
-          <w:lang w:val="es-MX"/>
-        </w:rPr>
-        <w:t>costo</w:t>
-      </w:r>
-      <w:r>
-        <w:rPr>
-          <w:lang w:val="es-MX"/>
-        </w:rPr>
-        <w:t xml:space="preserve"> de los productos. Inventario/Productos/Variantes del producto/Costo (Vale)</w:t>
+        <w:t xml:space="preserve">Para </w:t>
+      </w:r>
+      <w:r>
+        <w:rPr>
+          <w:lang w:val="es-MX"/>
+        </w:rPr>
+        <w:t xml:space="preserve">productos con </w:t>
+      </w:r>
+      <w:r>
+        <w:rPr>
+          <w:b/>
+          <w:lang w:val="es-MX"/>
+        </w:rPr>
+        <w:t>impuestos interno</w:t>
+      </w:r>
+      <w:r>
+        <w:rPr>
+          <w:lang w:val="es-MX"/>
+        </w:rPr>
+        <w:t>. Inventario/Productos/Variantes del producto</w:t>
+      </w:r>
+      <w:r>
+        <w:rPr>
+          <w:lang w:val="es-MX"/>
+        </w:rPr>
+        <w:t>/</w:t>
+      </w:r>
+      <w:proofErr w:type="spellStart"/>
+      <w:r>
+        <w:rPr>
+          <w:lang w:val="es-MX"/>
+        </w:rPr>
+        <w:t>productos_imp_interno</w:t>
+      </w:r>
+      <w:proofErr w:type="spellEnd"/>
+      <w:r>
+        <w:rPr>
+          <w:lang w:val="es-MX"/>
+        </w:rPr>
+        <w:t xml:space="preserve"> (Vale)</w:t>
       </w:r>
     </w:p>
     <w:p>
@@ -433,22 +463,22 @@
       </w:pPr>
       <w:r>
         <w:rPr>
-          <w:b/>
-          <w:lang w:val="es-MX"/>
-        </w:rPr>
-        <w:t>Proveedores</w:t>
-      </w:r>
-      <w:r>
-        <w:rPr>
-          <w:lang w:val="es-MX"/>
-        </w:rPr>
-        <w:t xml:space="preserve">: </w:t>
-      </w:r>
-      <w:r>
-        <w:rPr>
-          <w:lang w:val="es-MX"/>
-        </w:rPr>
-        <w:t>Inventario/Productos/Variantes del producto. Plantilla: “Proveedor (Vale)”</w:t>
+          <w:lang w:val="es-MX"/>
+        </w:rPr>
+        <w:t xml:space="preserve">Para el </w:t>
+      </w:r>
+      <w:r>
+        <w:rPr>
+          <w:b/>
+          <w:lang w:val="es-MX"/>
+        </w:rPr>
+        <w:t>costo</w:t>
+      </w:r>
+      <w:r>
+        <w:rPr>
+          <w:lang w:val="es-MX"/>
+        </w:rPr>
+        <w:t xml:space="preserve"> de los productos. Inventario/Productos/Variantes del producto/Costo (Vale)</w:t>
       </w:r>
     </w:p>
     <w:p>
@@ -467,6 +497,37 @@
           <w:b/>
           <w:lang w:val="es-MX"/>
         </w:rPr>
+        <w:t>Proveedores</w:t>
+      </w:r>
+      <w:r>
+        <w:rPr>
+          <w:lang w:val="es-MX"/>
+        </w:rPr>
+        <w:t xml:space="preserve">: </w:t>
+      </w:r>
+      <w:r>
+        <w:rPr>
+          <w:lang w:val="es-MX"/>
+        </w:rPr>
+        <w:t>Inventario/Productos/Variantes del producto. Plantilla: “Proveedor (Vale)”</w:t>
+      </w:r>
+    </w:p>
+    <w:p>
+      <w:pPr>
+        <w:pStyle w:val="Prrafodelista"/>
+        <w:numPr>
+          <w:ilvl w:val="0"/>
+          <w:numId w:val="1"/>
+        </w:numPr>
+        <w:rPr>
+          <w:lang w:val="es-MX"/>
+        </w:rPr>
+      </w:pPr>
+      <w:r>
+        <w:rPr>
+          <w:b/>
+          <w:lang w:val="es-MX"/>
+        </w:rPr>
         <w:t>Gastos</w:t>
       </w:r>
       <w:r>
@@ -489,6 +550,42 @@
         </w:rPr>
         <w:t xml:space="preserve"> así como viene.</w:t>
       </w:r>
+    </w:p>
+    <w:p>
+      <w:pPr>
+        <w:pStyle w:val="Prrafodelista"/>
+        <w:numPr>
+          <w:ilvl w:val="0"/>
+          <w:numId w:val="1"/>
+        </w:numPr>
+        <w:rPr>
+          <w:lang w:val="es-MX"/>
+        </w:rPr>
+      </w:pPr>
+      <w:r>
+        <w:rPr>
+          <w:b/>
+          <w:highlight w:val="yellow"/>
+          <w:lang w:val="es-MX"/>
+        </w:rPr>
+        <w:t xml:space="preserve">Datos clientes </w:t>
+      </w:r>
+      <w:r>
+        <w:rPr>
+          <w:highlight w:val="yellow"/>
+          <w:lang w:val="es-MX"/>
+        </w:rPr>
+        <w:t>de la sección de contactos para cruzar con los que figuran en las órdenes y así poder identificar a los clientes de los proveedores: Contactos/Datos clientes (Vale)</w:t>
+      </w:r>
+      <w:r>
+        <w:rPr>
+          <w:highlight w:val="yellow"/>
+          <w:lang w:val="es-MX"/>
+        </w:rPr>
+        <w:t>. VER SI CON LO QUE DESCARGO DE FACTURAS CON DATOS DE CLIENTES ES SUFICIENTE Y NO HACE FALTA CRUZAR PARA OBTENER DATOS (MAIL, ETC). REVISAR QUE NO DUPLIQUE FILAS</w:t>
+      </w:r>
+      <w:bookmarkStart w:id="0" w:name="_GoBack"/>
+      <w:bookmarkEnd w:id="0"/>
     </w:p>
     <w:p>
       <w:pPr>
@@ -732,6 +829,7 @@
         <w:rPr>
           <w:lang w:val="es-MX"/>
         </w:rPr>
+        <w:lastRenderedPageBreak/>
         <w:t>Condición: fuera de venta no tiene que tener stock en las tiendas y agregar como fuera de venta lo que es lana y alpaca</w:t>
       </w:r>
       <w:r>
@@ -842,7 +940,6 @@
         <w:rPr>
           <w:lang w:val="es-MX"/>
         </w:rPr>
-        <w:lastRenderedPageBreak/>
         <w:t>No hace falta que pongan la hora en las notas.</w:t>
       </w:r>
     </w:p>
@@ -927,8 +1024,6 @@
         </w:rPr>
         <w:t>lafatroY2586#</w:t>
       </w:r>
-      <w:bookmarkStart w:id="0" w:name="_GoBack"/>
-      <w:bookmarkEnd w:id="0"/>
     </w:p>
     <w:p>
       <w:pPr>
@@ -1361,6 +1456,7 @@
         <w:rPr>
           <w:lang w:val="es-MX"/>
         </w:rPr>
+        <w:lastRenderedPageBreak/>
         <w:t xml:space="preserve">crédito 1,8%, </w:t>
       </w:r>
       <w:proofErr w:type="spellStart"/>

</xml_diff>